<commit_message>
Cohérence des livrables après les renommages
Les livrables désignent désormais les fichiers renommés de la même
façon partout.

Modifications :
- fiche stagiaire intitulée « Principes WCAG - fiche stagiaire »
- note de la slide 28 accentuée et citant fiche-stagiaire-principes-wcag.pdf
- cartes des critères WCAG 2.2 ajoutées aux supports de la fiche
  technique ; formulation du todo alignée
- le nouveau titre déclenchait le bug WeasyPrint des tableaux
  fragmentés (repli en PDF tagué sans structure) : tableaux gardés
  entiers, section web sur une nouvelle page et cellules resserrées,
  la fiche reste en PDF/UA-1 (5 pages)
</commit_message>
<xml_diff>
--- a/livrables-IGPDE-2026-102846/Formateur/documents-administratifs-igpde/102846FiTechn-v2.docx
+++ b/livrables-IGPDE-2026-102846/Formateur/documents-administratifs-igpde/102846FiTechn-v2.docx
@@ -967,6 +967,18 @@
       </w:pPr>
       <w:r>
         <w:t xml:space="preserve">Fiche formateur et fiche stagiaire sur les principes WCAG (PDF).</w:t>
+      </w:r>
+    </w:p>
+    <w:p>
+      <w:pPr>
+        <w:pStyle w:val="Compact"/>
+        <w:numPr>
+          <w:ilvl w:val="0"/>
+          <w:numId w:val="11"/>
+        </w:numPr>
+      </w:pPr>
+      <w:r>
+        <w:t xml:space="preserve">Cartes des critères WCAG 2.2, 6 par page (PDF, à imprimer avant la session).</w:t>
       </w:r>
     </w:p>
     <w:p>

</xml_diff>

<commit_message>
Documents IGPDE : décisions de cohérence
Applique les décisions prises après la revue de cohérence des
documents administratifs avec les livrables.

- Déroulé : VSME devient audio-description ; points clés du
  module 1, quiz de clôture et plan d'action individuel retirés ;
  clôture et bilan recentrés sur questions, contacts et ressources
  partagées, niveau Bloom « évaluer ».
- Fiche équipement : LibreOffice Writer ajouté ; le fichier de
  ressources est liens-tp-en-ligne.pdf ; Atalan, WebAIM, Contrast
  Finder, Silktide et Checklists Opquast ajoutés aux accès ; outils
  du dossier partagé installés sur chaque poste.
- Programme : audit en binôme avec la grille mentionné ; retour sur
  les points clés retiré, faute de slide.
- Test d'alignement : vérifie l'installation de PAC sur chaque
  poste au lieu de l'ancien libellé « préinstallé ».
</commit_message>
<xml_diff>
--- a/livrables-IGPDE-2026-102846/Formateur/documents-administratifs-igpde/102846FiTechn-v2.docx
+++ b/livrables-IGPDE-2026-102846/Formateur/documents-administratifs-igpde/102846FiTechn-v2.docx
@@ -396,6 +396,20 @@
       </w:pPr>
       <w:r>
         <w:rPr/>
+        <w:t>LibreOffice Writer</w:t>
+      </w:r>
+    </w:p>
+    <w:p>
+      <w:pPr>
+        <w:pStyle w:val="Compact"/>
+        <w:numPr>
+          <w:ilvl w:val="0"/>
+          <w:numId w:val="1"/>
+        </w:numPr>
+        <w:rPr/>
+      </w:pPr>
+      <w:r>
+        <w:rPr/>
         <w:t>Navigateurs Firefox et Edge installés.</w:t>
       </w:r>
     </w:p>
@@ -465,6 +479,20 @@
       <w:r>
         <w:rPr/>
         <w:t>Microsoft Word installé.</w:t>
+      </w:r>
+    </w:p>
+    <w:p>
+      <w:pPr>
+        <w:pStyle w:val="Compact"/>
+        <w:numPr>
+          <w:ilvl w:val="0"/>
+          <w:numId w:val="1"/>
+        </w:numPr>
+        <w:rPr/>
+      </w:pPr>
+      <w:r>
+        <w:rPr/>
+        <w:t>LibreOffice Writer installé.</w:t>
       </w:r>
     </w:p>
     <w:p>
@@ -572,6 +600,20 @@
       </w:pPr>
       <w:r>
         <w:rPr/>
+        <w:t>LibreOffice Writer pour la variante Writer des exercices, avec le mémo LibreOffice Writer.</w:t>
+      </w:r>
+    </w:p>
+    <w:p>
+      <w:pPr>
+        <w:pStyle w:val="Compact"/>
+        <w:numPr>
+          <w:ilvl w:val="0"/>
+          <w:numId w:val="1"/>
+        </w:numPr>
+        <w:rPr/>
+      </w:pPr>
+      <w:r>
+        <w:rPr/>
         <w:t>Lecteur PDF pour ouvrir les supports exportés.</w:t>
       </w:r>
     </w:p>
@@ -612,7 +654,7 @@
       </w:pPr>
       <w:r>
         <w:rPr/>
-        <w:t>PDF Accessibility Checker 2024 préinstallé sur les postes utilisés pour le contrôle du PDF.</w:t>
+        <w:t>PDF Accessibility Checker 2024 installé sur chaque poste, formateur et stagiaires, pour le contrôle du PDF.</w:t>
       </w:r>
     </w:p>
     <w:p>
@@ -686,7 +728,7 @@
       </w:hyperlink>
       <w:r>
         <w:rPr/>
-        <w:t xml:space="preserve"> installé au minimum sur le poste formateur.</w:t>
+        <w:t xml:space="preserve"> installé sur chaque poste, formateur et stagiaires.</w:t>
       </w:r>
     </w:p>
     <w:p>
@@ -1033,21 +1075,7 @@
       </w:pPr>
       <w:r>
         <w:rPr/>
-        <w:t>Fichier de ressources et liens utiles.</w:t>
-      </w:r>
-    </w:p>
-    <w:p>
-      <w:pPr>
-        <w:pStyle w:val="Compact"/>
-        <w:numPr>
-          <w:ilvl w:val="0"/>
-          <w:numId w:val="1"/>
-        </w:numPr>
-        <w:rPr/>
-      </w:pPr>
-      <w:r>
-        <w:rPr/>
-        <w:t>Fiche des liens des TP en ligne (liens-tp-en-ligne.pdf).</w:t>
+        <w:t>Fichier de ressources et liens utiles : fiche des liens des TP en ligne (liens-tp-en-ligne.pdf).</w:t>
       </w:r>
     </w:p>
     <w:p>
@@ -2493,6 +2521,490 @@
           </w:p>
         </w:tc>
       </w:tr>
+      <w:tr>
+        <w:trPr>
+          <w:cantSplit/>
+        </w:trPr>
+        <w:tc>
+          <w:tcPr>
+            <w:tcW w:w="3024" w:type="dxa"/>
+            <w:tcBorders/>
+            <w:shd w:color="auto" w:fill="F5F5FE" w:val="clear"/>
+          </w:tcPr>
+          <w:p>
+            <w:pPr>
+              <w:pStyle w:val="Compact"/>
+              <w:widowControl/>
+              <w:spacing w:before="36" w:after="120"/>
+              <w:jc w:val="start"/>
+              <w:rPr>
+                <w:rFonts w:eastAsia="" w:cs=""/>
+                <w:kern w:val="0"/>
+                <w:szCs w:val="24"/>
+                <w:lang w:val="fr-FR" w:eastAsia="zh-CN" w:bidi="ar-SA"/>
+              </w:rPr>
+            </w:pPr>
+            <w:hyperlink r:id="rId35">
+              <w:r>
+                <w:rPr>
+                  <w:rStyle w:val="Hyperlink"/>
+                  <w:rFonts w:eastAsia="" w:cs=""/>
+                  <w:kern w:val="0"/>
+                  <w:szCs w:val="24"/>
+                  <w:lang w:val="fr-FR" w:eastAsia="zh-CN" w:bidi="ar-SA"/>
+                </w:rPr>
+                <w:t>Atalan - Agissons</w:t>
+              </w:r>
+            </w:hyperlink>
+          </w:p>
+        </w:tc>
+        <w:tc>
+          <w:tcPr>
+            <w:tcW w:w="3024" w:type="dxa"/>
+            <w:tcBorders/>
+            <w:shd w:color="auto" w:fill="F5F5FE" w:val="clear"/>
+          </w:tcPr>
+          <w:p>
+            <w:pPr>
+              <w:pStyle w:val="Compact"/>
+              <w:widowControl/>
+              <w:spacing w:before="36" w:after="120"/>
+              <w:jc w:val="start"/>
+              <w:rPr>
+                <w:rFonts w:eastAsia="" w:cs=""/>
+                <w:kern w:val="0"/>
+                <w:szCs w:val="24"/>
+                <w:lang w:val="fr-FR" w:eastAsia="zh-CN" w:bidi="ar-SA"/>
+              </w:rPr>
+            </w:pPr>
+            <w:r>
+              <w:rPr>
+                <w:rFonts w:eastAsia="" w:cs=""/>
+                <w:kern w:val="0"/>
+                <w:szCs w:val="24"/>
+                <w:lang w:val="fr-FR" w:eastAsia="zh-CN" w:bidi="ar-SA"/>
+              </w:rPr>
+              <w:t>Simulations de situations de handicap pendant le module 1</w:t>
+            </w:r>
+          </w:p>
+        </w:tc>
+        <w:tc>
+          <w:tcPr>
+            <w:tcW w:w="3024" w:type="dxa"/>
+            <w:tcBorders/>
+            <w:shd w:color="auto" w:fill="F5F5FE" w:val="clear"/>
+          </w:tcPr>
+          <w:p>
+            <w:pPr>
+              <w:pStyle w:val="Compact"/>
+              <w:widowControl/>
+              <w:spacing w:before="36" w:after="120"/>
+              <w:jc w:val="start"/>
+              <w:rPr>
+                <w:rFonts w:eastAsia="" w:cs=""/>
+                <w:kern w:val="0"/>
+                <w:szCs w:val="24"/>
+                <w:lang w:val="fr-FR" w:eastAsia="zh-CN" w:bidi="ar-SA"/>
+              </w:rPr>
+            </w:pPr>
+            <w:r>
+              <w:rPr>
+                <w:rFonts w:eastAsia="" w:cs=""/>
+                <w:kern w:val="0"/>
+                <w:szCs w:val="24"/>
+                <w:lang w:val="fr-FR" w:eastAsia="zh-CN" w:bidi="ar-SA"/>
+              </w:rPr>
+              <w:t>Navigation libre des stagiaires pendant 5 minutes. Domaine à autoriser : atalan.fr.</w:t>
+            </w:r>
+          </w:p>
+        </w:tc>
+      </w:tr>
+      <w:tr>
+        <w:trPr>
+          <w:cantSplit/>
+        </w:trPr>
+        <w:tc>
+          <w:tcPr>
+            <w:tcW w:w="3024" w:type="dxa"/>
+            <w:tcBorders/>
+          </w:tcPr>
+          <w:p>
+            <w:pPr>
+              <w:pStyle w:val="Compact"/>
+              <w:widowControl/>
+              <w:spacing w:before="36" w:after="120"/>
+              <w:jc w:val="start"/>
+              <w:rPr>
+                <w:rFonts w:eastAsia="" w:cs=""/>
+                <w:kern w:val="0"/>
+                <w:szCs w:val="24"/>
+                <w:lang w:val="fr-FR" w:eastAsia="zh-CN" w:bidi="ar-SA"/>
+              </w:rPr>
+            </w:pPr>
+            <w:hyperlink r:id="rId36">
+              <w:r>
+                <w:rPr>
+                  <w:rStyle w:val="Hyperlink"/>
+                  <w:rFonts w:eastAsia="" w:cs=""/>
+                  <w:kern w:val="0"/>
+                  <w:szCs w:val="24"/>
+                  <w:lang w:val="fr-FR" w:eastAsia="zh-CN" w:bidi="ar-SA"/>
+                </w:rPr>
+                <w:t>WebAIM</w:t>
+              </w:r>
+            </w:hyperlink>
+          </w:p>
+        </w:tc>
+        <w:tc>
+          <w:tcPr>
+            <w:tcW w:w="3024" w:type="dxa"/>
+            <w:tcBorders/>
+          </w:tcPr>
+          <w:p>
+            <w:pPr>
+              <w:pStyle w:val="Compact"/>
+              <w:widowControl/>
+              <w:spacing w:before="36" w:after="120"/>
+              <w:jc w:val="start"/>
+              <w:rPr>
+                <w:rFonts w:eastAsia="" w:cs=""/>
+                <w:kern w:val="0"/>
+                <w:szCs w:val="24"/>
+                <w:lang w:val="fr-FR" w:eastAsia="zh-CN" w:bidi="ar-SA"/>
+              </w:rPr>
+            </w:pPr>
+            <w:r>
+              <w:rPr>
+                <w:rFonts w:eastAsia="" w:cs=""/>
+                <w:kern w:val="0"/>
+                <w:szCs w:val="24"/>
+                <w:lang w:val="fr-FR" w:eastAsia="zh-CN" w:bidi="ar-SA"/>
+              </w:rPr>
+              <w:t>Vérificateur de contraste et chiffres WebAIM Million pendant le module web</w:t>
+            </w:r>
+          </w:p>
+        </w:tc>
+        <w:tc>
+          <w:tcPr>
+            <w:tcW w:w="3024" w:type="dxa"/>
+            <w:tcBorders/>
+          </w:tcPr>
+          <w:p>
+            <w:pPr>
+              <w:pStyle w:val="Compact"/>
+              <w:widowControl/>
+              <w:spacing w:before="36" w:after="120"/>
+              <w:jc w:val="start"/>
+              <w:rPr>
+                <w:rFonts w:eastAsia="" w:cs=""/>
+                <w:kern w:val="0"/>
+                <w:szCs w:val="24"/>
+                <w:lang w:val="fr-FR" w:eastAsia="zh-CN" w:bidi="ar-SA"/>
+              </w:rPr>
+            </w:pPr>
+            <w:r>
+              <w:rPr>
+                <w:rFonts w:eastAsia="" w:cs=""/>
+                <w:kern w:val="0"/>
+                <w:szCs w:val="24"/>
+                <w:lang w:val="fr-FR" w:eastAsia="zh-CN" w:bidi="ar-SA"/>
+              </w:rPr>
+              <w:t>Outil web de contrôle des contrastes. Domaine à autoriser : webaim.org.</w:t>
+            </w:r>
+          </w:p>
+        </w:tc>
+      </w:tr>
+      <w:tr>
+        <w:trPr>
+          <w:cantSplit/>
+        </w:trPr>
+        <w:tc>
+          <w:tcPr>
+            <w:tcW w:w="3024" w:type="dxa"/>
+            <w:tcBorders/>
+            <w:shd w:color="auto" w:fill="F5F5FE" w:val="clear"/>
+          </w:tcPr>
+          <w:p>
+            <w:pPr>
+              <w:pStyle w:val="Compact"/>
+              <w:widowControl/>
+              <w:spacing w:before="36" w:after="120"/>
+              <w:jc w:val="start"/>
+              <w:rPr>
+                <w:rFonts w:eastAsia="" w:cs=""/>
+                <w:kern w:val="0"/>
+                <w:szCs w:val="24"/>
+                <w:lang w:val="fr-FR" w:eastAsia="zh-CN" w:bidi="ar-SA"/>
+              </w:rPr>
+            </w:pPr>
+            <w:hyperlink r:id="rId9">
+              <w:r>
+                <w:rPr>
+                  <w:rStyle w:val="Hyperlink"/>
+                  <w:rFonts w:eastAsia="" w:cs=""/>
+                  <w:kern w:val="0"/>
+                  <w:szCs w:val="24"/>
+                  <w:lang w:val="fr-FR" w:eastAsia="zh-CN" w:bidi="ar-SA"/>
+                </w:rPr>
+                <w:t>Contrast Finder</w:t>
+              </w:r>
+            </w:hyperlink>
+          </w:p>
+        </w:tc>
+        <w:tc>
+          <w:tcPr>
+            <w:tcW w:w="3024" w:type="dxa"/>
+            <w:tcBorders/>
+            <w:shd w:color="auto" w:fill="F5F5FE" w:val="clear"/>
+          </w:tcPr>
+          <w:p>
+            <w:pPr>
+              <w:pStyle w:val="Compact"/>
+              <w:widowControl/>
+              <w:spacing w:before="36" w:after="120"/>
+              <w:jc w:val="start"/>
+              <w:rPr>
+                <w:rFonts w:eastAsia="" w:cs=""/>
+                <w:kern w:val="0"/>
+                <w:szCs w:val="24"/>
+                <w:lang w:val="fr-FR" w:eastAsia="zh-CN" w:bidi="ar-SA"/>
+              </w:rPr>
+            </w:pPr>
+            <w:r>
+              <w:rPr>
+                <w:rFonts w:eastAsia="" w:cs=""/>
+                <w:kern w:val="0"/>
+                <w:szCs w:val="24"/>
+                <w:lang w:val="fr-FR" w:eastAsia="zh-CN" w:bidi="ar-SA"/>
+              </w:rPr>
+              <w:t>Recherche de couleurs de contraste conformes</w:t>
+            </w:r>
+          </w:p>
+        </w:tc>
+        <w:tc>
+          <w:tcPr>
+            <w:tcW w:w="3024" w:type="dxa"/>
+            <w:tcBorders/>
+            <w:shd w:color="auto" w:fill="F5F5FE" w:val="clear"/>
+          </w:tcPr>
+          <w:p>
+            <w:pPr>
+              <w:pStyle w:val="Compact"/>
+              <w:widowControl/>
+              <w:spacing w:before="36" w:after="120"/>
+              <w:jc w:val="start"/>
+              <w:rPr>
+                <w:rFonts w:eastAsia="" w:cs=""/>
+                <w:kern w:val="0"/>
+                <w:szCs w:val="24"/>
+                <w:lang w:val="fr-FR" w:eastAsia="zh-CN" w:bidi="ar-SA"/>
+              </w:rPr>
+            </w:pPr>
+            <w:r>
+              <w:rPr>
+                <w:rFonts w:eastAsia="" w:cs=""/>
+                <w:kern w:val="0"/>
+                <w:szCs w:val="24"/>
+                <w:lang w:val="fr-FR" w:eastAsia="zh-CN" w:bidi="ar-SA"/>
+              </w:rPr>
+              <w:t>Service web, sans installation. Domaine à autoriser : app.contrast-finder.org.</w:t>
+            </w:r>
+          </w:p>
+        </w:tc>
+      </w:tr>
+      <w:tr>
+        <w:trPr>
+          <w:cantSplit/>
+        </w:trPr>
+        <w:tc>
+          <w:tcPr>
+            <w:tcW w:w="3024" w:type="dxa"/>
+            <w:tcBorders/>
+          </w:tcPr>
+          <w:p>
+            <w:pPr>
+              <w:pStyle w:val="Compact"/>
+              <w:widowControl/>
+              <w:spacing w:before="36" w:after="120"/>
+              <w:jc w:val="start"/>
+              <w:rPr>
+                <w:rFonts w:eastAsia="" w:cs=""/>
+                <w:kern w:val="0"/>
+                <w:szCs w:val="24"/>
+                <w:lang w:val="fr-FR" w:eastAsia="zh-CN" w:bidi="ar-SA"/>
+              </w:rPr>
+            </w:pPr>
+            <w:hyperlink r:id="rId8">
+              <w:r>
+                <w:rPr>
+                  <w:rStyle w:val="Hyperlink"/>
+                  <w:rFonts w:eastAsia="" w:cs=""/>
+                  <w:kern w:val="0"/>
+                  <w:szCs w:val="24"/>
+                  <w:lang w:val="fr-FR" w:eastAsia="zh-CN" w:bidi="ar-SA"/>
+                </w:rPr>
+                <w:t>Silktide</w:t>
+              </w:r>
+            </w:hyperlink>
+          </w:p>
+        </w:tc>
+        <w:tc>
+          <w:tcPr>
+            <w:tcW w:w="3024" w:type="dxa"/>
+            <w:tcBorders/>
+          </w:tcPr>
+          <w:p>
+            <w:pPr>
+              <w:pStyle w:val="Compact"/>
+              <w:widowControl/>
+              <w:spacing w:before="36" w:after="120"/>
+              <w:jc w:val="start"/>
+              <w:rPr>
+                <w:rFonts w:eastAsia="" w:cs=""/>
+                <w:kern w:val="0"/>
+                <w:szCs w:val="24"/>
+                <w:lang w:val="fr-FR" w:eastAsia="zh-CN" w:bidi="ar-SA"/>
+              </w:rPr>
+            </w:pPr>
+            <w:r>
+              <w:rPr>
+                <w:rFonts w:eastAsia="" w:cs=""/>
+                <w:kern w:val="0"/>
+                <w:szCs w:val="24"/>
+                <w:lang w:val="fr-FR" w:eastAsia="zh-CN" w:bidi="ar-SA"/>
+              </w:rPr>
+              <w:t>Test web complémentaire</w:t>
+            </w:r>
+          </w:p>
+        </w:tc>
+        <w:tc>
+          <w:tcPr>
+            <w:tcW w:w="3024" w:type="dxa"/>
+            <w:tcBorders/>
+          </w:tcPr>
+          <w:p>
+            <w:pPr>
+              <w:pStyle w:val="Compact"/>
+              <w:widowControl/>
+              <w:spacing w:before="36" w:after="120"/>
+              <w:jc w:val="start"/>
+              <w:rPr>
+                <w:rFonts w:eastAsia="" w:cs=""/>
+                <w:kern w:val="0"/>
+                <w:szCs w:val="24"/>
+                <w:lang w:val="fr-FR" w:eastAsia="zh-CN" w:bidi="ar-SA"/>
+              </w:rPr>
+            </w:pPr>
+            <w:r>
+              <w:rPr>
+                <w:rFonts w:eastAsia="" w:cs=""/>
+                <w:kern w:val="0"/>
+                <w:szCs w:val="24"/>
+                <w:lang w:val="fr-FR" w:eastAsia="zh-CN" w:bidi="ar-SA"/>
+              </w:rPr>
+              <w:t>Extension de navigateur à installer avant la session si les droits sont limités. Domaine à autoriser : silktide.com.</w:t>
+            </w:r>
+          </w:p>
+        </w:tc>
+      </w:tr>
+      <w:tr>
+        <w:trPr>
+          <w:cantSplit/>
+        </w:trPr>
+        <w:tc>
+          <w:tcPr>
+            <w:tcW w:w="3024" w:type="dxa"/>
+            <w:tcBorders/>
+            <w:shd w:color="auto" w:fill="F5F5FE" w:val="clear"/>
+          </w:tcPr>
+          <w:p>
+            <w:pPr>
+              <w:pStyle w:val="Compact"/>
+              <w:widowControl/>
+              <w:spacing w:before="36" w:after="120"/>
+              <w:jc w:val="start"/>
+              <w:rPr>
+                <w:rFonts w:eastAsia="" w:cs=""/>
+                <w:kern w:val="0"/>
+                <w:szCs w:val="24"/>
+                <w:lang w:val="fr-FR" w:eastAsia="zh-CN" w:bidi="ar-SA"/>
+              </w:rPr>
+            </w:pPr>
+            <w:hyperlink r:id="rId37">
+              <w:r>
+                <w:rPr>
+                  <w:rStyle w:val="Hyperlink"/>
+                  <w:rFonts w:eastAsia="" w:cs=""/>
+                  <w:kern w:val="0"/>
+                  <w:szCs w:val="24"/>
+                  <w:lang w:val="fr-FR" w:eastAsia="zh-CN" w:bidi="ar-SA"/>
+                </w:rPr>
+                <w:t>Checklists Opquast</w:t>
+              </w:r>
+            </w:hyperlink>
+          </w:p>
+        </w:tc>
+        <w:tc>
+          <w:tcPr>
+            <w:tcW w:w="3024" w:type="dxa"/>
+            <w:tcBorders/>
+            <w:shd w:color="auto" w:fill="F5F5FE" w:val="clear"/>
+          </w:tcPr>
+          <w:p>
+            <w:pPr>
+              <w:pStyle w:val="Compact"/>
+              <w:widowControl/>
+              <w:spacing w:before="36" w:after="120"/>
+              <w:jc w:val="start"/>
+              <w:rPr>
+                <w:rFonts w:eastAsia="" w:cs=""/>
+                <w:kern w:val="0"/>
+                <w:szCs w:val="24"/>
+                <w:lang w:val="fr-FR" w:eastAsia="zh-CN" w:bidi="ar-SA"/>
+              </w:rPr>
+            </w:pPr>
+            <w:r>
+              <w:rPr>
+                <w:rFonts w:eastAsia="" w:cs=""/>
+                <w:kern w:val="0"/>
+                <w:szCs w:val="24"/>
+                <w:lang w:val="fr-FR" w:eastAsia="zh-CN" w:bidi="ar-SA"/>
+              </w:rPr>
+              <w:t>Règle sur les caractères détournés, séquence réseaux sociaux</w:t>
+            </w:r>
+          </w:p>
+        </w:tc>
+        <w:tc>
+          <w:tcPr>
+            <w:tcW w:w="3024" w:type="dxa"/>
+            <w:tcBorders/>
+            <w:shd w:color="auto" w:fill="F5F5FE" w:val="clear"/>
+          </w:tcPr>
+          <w:p>
+            <w:pPr>
+              <w:pStyle w:val="Compact"/>
+              <w:widowControl/>
+              <w:spacing w:before="36" w:after="120"/>
+              <w:jc w:val="start"/>
+              <w:rPr>
+                <w:rFonts w:eastAsia="" w:cs=""/>
+                <w:kern w:val="0"/>
+                <w:szCs w:val="24"/>
+                <w:lang w:val="fr-FR" w:eastAsia="zh-CN" w:bidi="ar-SA"/>
+              </w:rPr>
+            </w:pPr>
+            <w:r>
+              <w:rPr>
+                <w:rFonts w:eastAsia="" w:cs=""/>
+                <w:kern w:val="0"/>
+                <w:szCs w:val="24"/>
+                <w:lang w:val="fr-FR" w:eastAsia="zh-CN" w:bidi="ar-SA"/>
+              </w:rPr>
+              <w:t>Accès utile pour montrer la source de la bonne pratique. Domaine à autoriser : checklists.opquast.com.</w:t>
+            </w:r>
+          </w:p>
+        </w:tc>
+      </w:tr>
     </w:tbl>
     <w:p>
       <w:pPr>
@@ -2600,7 +3112,7 @@
       </w:pPr>
       <w:r>
         <w:rPr/>
-        <w:t>Préinstaller les outils qui nécessitent des droits administrateur, notamment PAC, et vérifier la disponibilité d’Acrobat Pro en solution de remplacement.</w:t>
+        <w:t>Installer sur chaque poste, formateur et stagiaires, les outils fournis dans le dossier partagé (dossier outils du pack) : NVDA 2024.4.1 et son extension Focus Highlight 6.6, Colour Contrast Analyser 3.5.4 et PDF Accessibility Checker 2024 (PAC 24.3.1.0). Vérifier la disponibilité d’Acrobat Pro en solution de remplacement.</w:t>
       </w:r>
     </w:p>
     <w:p>

</xml_diff>